<commit_message>
Complete week 2 API updates
</commit_message>
<xml_diff>
--- a/docs/api-specification.docx
+++ b/docs/api-specification.docx
@@ -512,18 +512,18 @@
               <w:rPr>
                 <w:sz w:val="16"/>
               </w:rPr>
-              <w:t xml:space="preserve">POST</w:t>
-            </w:r>
-          </w:p>
-          <w:p>
-            <w:pPr>
-              <w:spacing w:after="40"/>
-            </w:pPr>
-            <w:r>
-              <w:rPr>
-                <w:sz w:val="16"/>
-              </w:rPr>
-              <w:t xml:space="preserve">/api/v1/auth/verify-email</w:t>
+              <w:t xml:space="preserve">POST/api/v1/auth/verify-email</w:t>
+            </w:r>
+          </w:p>
+          <w:p>
+            <w:pPr>
+              <w:spacing w:after="40"/>
+            </w:pPr>
+            <w:r>
+              <w:rPr>
+                <w:sz w:val="16"/>
+              </w:rPr>
+              <w:t xml:space="preserve"/>
             </w:r>
           </w:p>
         </w:tc>
@@ -592,7 +592,7 @@
               <w:rPr>
                 <w:sz w:val="16"/>
               </w:rPr>
-              <w:t xml:space="preserve">200: user id, email, status ACTIVE, and email_verified_at.</w:t>
+              <w:t xml:space="preserve">200: email, email_verified_at, and status ACTIVE.</w:t>
             </w:r>
           </w:p>
         </w:tc>
@@ -639,18 +639,18 @@
               <w:rPr>
                 <w:sz w:val="16"/>
               </w:rPr>
-              <w:t xml:space="preserve">POST</w:t>
-            </w:r>
-          </w:p>
-          <w:p>
-            <w:pPr>
-              <w:spacing w:after="40"/>
-            </w:pPr>
-            <w:r>
-              <w:rPr>
-                <w:sz w:val="16"/>
-              </w:rPr>
-              <w:t xml:space="preserve">/api/v1/auth/resend-verification</w:t>
+              <w:t xml:space="preserve">POST/api/v1/auth/resend-verification</w:t>
+            </w:r>
+          </w:p>
+          <w:p>
+            <w:pPr>
+              <w:spacing w:after="40"/>
+            </w:pPr>
+            <w:r>
+              <w:rPr>
+                <w:sz w:val="16"/>
+              </w:rPr>
+              <w:t xml:space="preserve"/>
             </w:r>
           </w:p>
         </w:tc>
@@ -672,7 +672,7 @@
               <w:rPr>
                 <w:sz w:val="16"/>
               </w:rPr>
-              <w:t xml:space="preserve">Send a replacement code. Public; response must not reveal whether the email is registered.</w:t>
+              <w:t xml:space="preserve">Send a replacement code. Public; response does not reveal whether the email is registered.</w:t>
             </w:r>
           </w:p>
         </w:tc>
@@ -738,7 +738,7 @@
               <w:rPr>
                 <w:sz w:val="16"/>
               </w:rPr>
-              <w:t xml:space="preserve">200 accepted; 400 invalid input; 429 resend limit reached</w:t>
+              <w:t xml:space="preserve">200 accepted (including during cooldown); 400 invalid input</w:t>
             </w:r>
           </w:p>
         </w:tc>
@@ -763,18 +763,18 @@
               <w:rPr>
                 <w:sz w:val="16"/>
               </w:rPr>
-              <w:t xml:space="preserve">POST</w:t>
-            </w:r>
-          </w:p>
-          <w:p>
-            <w:pPr>
-              <w:spacing w:after="40"/>
-            </w:pPr>
-            <w:r>
-              <w:rPr>
-                <w:sz w:val="16"/>
-              </w:rPr>
-              <w:t xml:space="preserve">/api/v1/auth/login</w:t>
+              <w:t xml:space="preserve">POST/api/v1/auth/login</w:t>
+            </w:r>
+          </w:p>
+          <w:p>
+            <w:pPr>
+              <w:spacing w:after="40"/>
+            </w:pPr>
+            <w:r>
+              <w:rPr>
+                <w:sz w:val="16"/>
+              </w:rPr>
+              <w:t xml:space="preserve"/>
             </w:r>
           </w:p>
         </w:tc>
@@ -843,7 +843,7 @@
               <w:rPr>
                 <w:sz w:val="16"/>
               </w:rPr>
-              <w:t xml:space="preserve">200: access_token, token_type Bearer, expires_in, and basic user details.</w:t>
+              <w:t xml:space="preserve">200: access_token and token_type Bearer.</w:t>
             </w:r>
           </w:p>
         </w:tc>
@@ -866,7 +866,7 @@
               <w:rPr>
                 <w:sz w:val="16"/>
               </w:rPr>
-              <w:t xml:space="preserve">200 logged in; 400 invalid input; 401 invalid credentials; 403 unverified or suspended account</w:t>
+              <w:t xml:space="preserve">200 logged in; 400 invalid input; 401 invalid credentials; 403 unverified or inactive account</w:t>
             </w:r>
           </w:p>
         </w:tc>
@@ -1175,18 +1175,18 @@
               <w:rPr>
                 <w:sz w:val="16"/>
               </w:rPr>
-              <w:t xml:space="preserve">PUT</w:t>
-            </w:r>
-          </w:p>
-          <w:p>
-            <w:pPr>
-              <w:spacing w:after="40"/>
-            </w:pPr>
-            <w:r>
-              <w:rPr>
-                <w:sz w:val="16"/>
-              </w:rPr>
-              <w:t xml:space="preserve">/api/v1/resumes/me</w:t>
+              <w:t xml:space="preserve">POST/api/v1/resumes</w:t>
+            </w:r>
+          </w:p>
+          <w:p>
+            <w:pPr>
+              <w:spacing w:after="40"/>
+            </w:pPr>
+            <w:r>
+              <w:rPr>
+                <w:sz w:val="16"/>
+              </w:rPr>
+              <w:t xml:space="preserve"/>
             </w:r>
           </w:p>
         </w:tc>
@@ -1209,7 +1209,7 @@
               <w:rPr>
                 <w:sz w:val="16"/>
               </w:rPr>
-              <w:t xml:space="preserve">Create or replace the authenticated user's single resume. Bearer token required.</w:t>
+              <w:t xml:space="preserve">Create the authenticated user's resume. Bearer token required. The user ID comes from the token.</w:t>
             </w:r>
           </w:p>
         </w:tc>
@@ -1255,7 +1255,7 @@
               <w:rPr>
                 <w:sz w:val="16"/>
               </w:rPr>
-              <w:t xml:space="preserve">201 when created; 200 when replaced. Returns resume id, text, created_at, updated_at.</w:t>
+              <w:t xml:space="preserve">201: created resume with id, text, created_at, and updated_at.</w:t>
             </w:r>
           </w:p>
         </w:tc>
@@ -1278,7 +1278,135 @@
               <w:rPr>
                 <w:sz w:val="16"/>
               </w:rPr>
-              <w:t xml:space="preserve">201 created; 200 replaced; 400 invalid input; 401 not authenticated</w:t>
+              <w:t xml:space="preserve">201 created; 400 invalid or empty text; 401 not authenticated; 409 resume already exists for this account</w:t>
+            </w:r>
+          </w:p>
+        </w:tc>
+      </w:tr>
+      <w:tr>
+        <w:tc>
+          <w:tcPr>
+            <w:tcW w:w="1900" w:type="dxa"/>
+            <w:tcMar>
+              <w:top w:w="85" w:type="dxa"/>
+              <w:start w:w="85" w:type="dxa"/>
+              <w:bottom w:w="85" w:type="dxa"/>
+              <w:end w:w="85" w:type="dxa"/>
+            </w:tcMar>
+            <w:shd w:fill="F3F7F6" w:val="clear"/>
+          </w:tcPr>
+          <w:p>
+            <w:pPr>
+              <w:spacing w:after="40"/>
+            </w:pPr>
+            <w:r>
+              <w:rPr>
+                <w:sz w:val="16"/>
+              </w:rPr>
+              <w:t xml:space="preserve">PATCH/api/v1/resumes/me</w:t>
+            </w:r>
+          </w:p>
+          <w:p>
+            <w:pPr>
+              <w:spacing w:after="40"/>
+            </w:pPr>
+            <w:r>
+              <w:rPr>
+                <w:sz w:val="16"/>
+              </w:rPr>
+              <w:t xml:space="preserve"/>
+            </w:r>
+          </w:p>
+        </w:tc>
+        <w:tc>
+          <w:tcPr>
+            <w:tcW w:w="3000" w:type="dxa"/>
+            <w:tcMar>
+              <w:top w:w="85" w:type="dxa"/>
+              <w:start w:w="85" w:type="dxa"/>
+              <w:bottom w:w="85" w:type="dxa"/>
+              <w:end w:w="85" w:type="dxa"/>
+            </w:tcMar>
+            <w:shd w:fill="F3F7F6" w:val="clear"/>
+          </w:tcPr>
+          <w:p>
+            <w:pPr>
+              <w:spacing w:after="40"/>
+            </w:pPr>
+            <w:r>
+              <w:rPr>
+                <w:sz w:val="16"/>
+              </w:rPr>
+              <w:t xml:space="preserve">Update the authenticated user's resume text. Bearer token required.</w:t>
+            </w:r>
+          </w:p>
+        </w:tc>
+        <w:tc>
+          <w:tcPr>
+            <w:tcW w:w="3600" w:type="dxa"/>
+            <w:tcMar>
+              <w:top w:w="85" w:type="dxa"/>
+              <w:start w:w="85" w:type="dxa"/>
+              <w:bottom w:w="85" w:type="dxa"/>
+              <w:end w:w="85" w:type="dxa"/>
+            </w:tcMar>
+            <w:shd w:fill="F3F7F6" w:val="clear"/>
+          </w:tcPr>
+          <w:p>
+            <w:pPr>
+              <w:spacing w:after="40"/>
+            </w:pPr>
+            <w:r>
+              <w:rPr>
+                <w:sz w:val="16"/>
+              </w:rPr>
+              <w:t xml:space="preserve">{"text":"Updated plain-text resume content..."}</w:t>
+            </w:r>
+          </w:p>
+        </w:tc>
+        <w:tc>
+          <w:tcPr>
+            <w:tcW w:w="3600" w:type="dxa"/>
+            <w:tcMar>
+              <w:top w:w="85" w:type="dxa"/>
+              <w:start w:w="85" w:type="dxa"/>
+              <w:bottom w:w="85" w:type="dxa"/>
+              <w:end w:w="85" w:type="dxa"/>
+            </w:tcMar>
+            <w:shd w:fill="F3F7F6" w:val="clear"/>
+          </w:tcPr>
+          <w:p>
+            <w:pPr>
+              <w:spacing w:after="40"/>
+            </w:pPr>
+            <w:r>
+              <w:rPr>
+                <w:sz w:val="16"/>
+              </w:rPr>
+              <w:t xml:space="preserve">200: updated resume with id, text, created_at, and updated_at.</w:t>
+            </w:r>
+          </w:p>
+        </w:tc>
+        <w:tc>
+          <w:tcPr>
+            <w:tcW w:w="2300" w:type="dxa"/>
+            <w:tcMar>
+              <w:top w:w="85" w:type="dxa"/>
+              <w:start w:w="85" w:type="dxa"/>
+              <w:bottom w:w="85" w:type="dxa"/>
+              <w:end w:w="85" w:type="dxa"/>
+            </w:tcMar>
+            <w:shd w:fill="F3F7F6" w:val="clear"/>
+          </w:tcPr>
+          <w:p>
+            <w:pPr>
+              <w:spacing w:after="40"/>
+            </w:pPr>
+            <w:r>
+              <w:rPr>
+                <w:sz w:val="16"/>
+              </w:rPr>
+              <w:t xml:space="preserve">200 updated; 400 invalid or missing text; 401 not authenticated; 404 resume not found</w:t>
             </w:r>
           </w:p>
         </w:tc>
@@ -1472,18 +1600,18 @@
               <w:rPr>
                 <w:sz w:val="16"/>
               </w:rPr>
-              <w:t xml:space="preserve">POST</w:t>
-            </w:r>
-          </w:p>
-          <w:p>
-            <w:pPr>
-              <w:spacing w:after="40"/>
-            </w:pPr>
-            <w:r>
-              <w:rPr>
-                <w:sz w:val="16"/>
-              </w:rPr>
-              <w:t xml:space="preserve">/api/v1/tailoring-requests</w:t>
+              <w:t xml:space="preserve">POST/api/v1/tailoring-requests</w:t>
+            </w:r>
+          </w:p>
+          <w:p>
+            <w:pPr>
+              <w:spacing w:after="40"/>
+            </w:pPr>
+            <w:r>
+              <w:rPr>
+                <w:sz w:val="16"/>
+              </w:rPr>
+              <w:t xml:space="preserve"/>
             </w:r>
           </w:p>
         </w:tc>
@@ -1571,7 +1699,7 @@
               <w:rPr>
                 <w:sz w:val="16"/>
               </w:rPr>
-              <w:t xml:space="preserve">201 created; 400 invalid input/UUID; 401 not authenticated; 403 resume belongs to another user; 404 resume not found</w:t>
+              <w:t xml:space="preserve">201 created; 400 invalid input/UUID; 401 not authenticated; 404 resume not found or not owned by caller</w:t>
             </w:r>
           </w:p>
         </w:tc>

</xml_diff>

<commit_message>
Added stale status for user updates to tailored requests
</commit_message>
<xml_diff>
--- a/docs/api-specification.docx
+++ b/docs/api-specification.docx
@@ -1337,7 +1337,7 @@
               <w:rPr>
                 <w:sz w:val="16"/>
               </w:rPr>
-              <w:t xml:space="preserve">Update the authenticated user's resume text. Bearer token required.</w:t>
+              <w:t xml:space="preserve">Update the authenticated user resume. Existing completed requests using it become STALE; their result and generated_at are retained.</w:t>
             </w:r>
           </w:p>
         </w:tc>
@@ -1383,7 +1383,7 @@
               <w:rPr>
                 <w:sz w:val="16"/>
               </w:rPr>
-              <w:t xml:space="preserve">200: updated resume with id, text, created_at, and updated_at.</w:t>
+              <w:t xml:space="preserve">200: updated resume; completed linked requests with results are marked STALE and retain their result and generated_at.</w:t>
             </w:r>
           </w:p>
         </w:tc>
@@ -2009,53 +2009,53 @@
               <w:rPr>
                 <w:sz w:val="16"/>
               </w:rPr>
-              <w:t xml:space="preserve">Update job_title, company_name, and/or job_description. Bearer token required.</w:t>
-            </w:r>
-          </w:p>
-        </w:tc>
-        <w:tc>
-          <w:tcPr>
-            <w:tcW w:w="3600" w:type="dxa"/>
-            <w:tcMar>
-              <w:top w:w="85" w:type="dxa"/>
-              <w:start w:w="85" w:type="dxa"/>
-              <w:bottom w:w="85" w:type="dxa"/>
-              <w:end w:w="85" w:type="dxa"/>
-            </w:tcMar>
-            <w:shd w:fill="F3F7F6" w:val="clear"/>
-          </w:tcPr>
-          <w:p>
-            <w:pPr>
-              <w:spacing w:after="40"/>
-            </w:pPr>
-            <w:r>
-              <w:rPr>
-                <w:sz w:val="16"/>
-              </w:rPr>
-              <w:t xml:space="preserve">{"job_title":"Junior Backend Developer"}</w:t>
-            </w:r>
-          </w:p>
-        </w:tc>
-        <w:tc>
-          <w:tcPr>
-            <w:tcW w:w="3600" w:type="dxa"/>
-            <w:tcMar>
-              <w:top w:w="85" w:type="dxa"/>
-              <w:start w:w="85" w:type="dxa"/>
-              <w:bottom w:w="85" w:type="dxa"/>
-              <w:end w:w="85" w:type="dxa"/>
-            </w:tcMar>
-            <w:shd w:fill="F3F7F6" w:val="clear"/>
-          </w:tcPr>
-          <w:p>
-            <w:pPr>
-              <w:spacing w:after="40"/>
-            </w:pPr>
-            <w:r>
-              <w:rPr>
-                <w:sz w:val="16"/>
-              </w:rPr>
-              <w:t xml:space="preserve">200: updated tailoring request.</w:t>
+              <w:t xml:space="preserve">Update job details or edit the generated result. Bearer token required. Send source fields and result in separate requests.</w:t>
+            </w:r>
+          </w:p>
+        </w:tc>
+        <w:tc>
+          <w:tcPr>
+            <w:tcW w:w="3600" w:type="dxa"/>
+            <w:tcMar>
+              <w:top w:w="85" w:type="dxa"/>
+              <w:start w:w="85" w:type="dxa"/>
+              <w:bottom w:w="85" w:type="dxa"/>
+              <w:end w:w="85" w:type="dxa"/>
+            </w:tcMar>
+            <w:shd w:fill="F3F7F6" w:val="clear"/>
+          </w:tcPr>
+          <w:p>
+            <w:pPr>
+              <w:spacing w:after="40"/>
+            </w:pPr>
+            <w:r>
+              <w:rPr>
+                <w:sz w:val="16"/>
+              </w:rPr>
+              <w:t xml:space="preserve">Job detail fields, or {"result":{...full TailoringResult...}}. Do not combine them.</w:t>
+            </w:r>
+          </w:p>
+        </w:tc>
+        <w:tc>
+          <w:tcPr>
+            <w:tcW w:w="3600" w:type="dxa"/>
+            <w:tcMar>
+              <w:top w:w="85" w:type="dxa"/>
+              <w:start w:w="85" w:type="dxa"/>
+              <w:bottom w:w="85" w:type="dxa"/>
+              <w:end w:w="85" w:type="dxa"/>
+            </w:tcMar>
+            <w:shd w:fill="F3F7F6" w:val="clear"/>
+          </w:tcPr>
+          <w:p>
+            <w:pPr>
+              <w:spacing w:after="40"/>
+            </w:pPr>
+            <w:r>
+              <w:rPr>
+                <w:sz w:val="16"/>
+              </w:rPr>
+              <w:t xml:space="preserve">200: source changes preserve an existing result and generated_at, marking it STALE; result-only edits keep status COMPLETED and generated_at unchanged.</w:t>
             </w:r>
           </w:p>
         </w:tc>
@@ -2078,7 +2078,7 @@
               <w:rPr>
                 <w:sz w:val="16"/>
               </w:rPr>
-              <w:t xml:space="preserve">200 updated; 400 invalid UUID/input; 401 not authenticated; 404 not found</w:t>
+              <w:t xml:space="preserve">200 updated; 400 invalid UUID/input, malformed result, mixed source/result update, or result not editable; 401 not authenticated; 404 not found</w:t>
             </w:r>
           </w:p>
         </w:tc>
@@ -2738,7 +2738,7 @@
               <w:rPr>
                 <w:sz w:val="16"/>
               </w:rPr>
-              <w:t xml:space="preserve">PENDING, COMPLETED, FAILED.</w:t>
+              <w:t xml:space="preserve">PENDING, COMPLETED, STALE, FAILED. STALE means a saved result exists but its resume or job details have changed.</w:t>
             </w:r>
           </w:p>
         </w:tc>
@@ -2838,6 +2838,26 @@
         </w:tc>
       </w:tr>
     </w:tbl>
+    <w:p>
+      <w:r>
+        <w:t xml:space="preserve">Stale result handling</w:t>
+      </w:r>
+    </w:p>
+    <w:p>
+      <w:r>
+        <w:t xml:space="preserve">If the resume text or job details change after generation, retain the existing result and generated_at and set status to STALE. Requests without a generated result remain PENDING.</w:t>
+      </w:r>
+    </w:p>
+    <w:p>
+      <w:r>
+        <w:t xml:space="preserve">A successful regeneration replaces the result, updates generated_at, and sets status to COMPLETED. A user edit to the result alone keeps status COMPLETED and does not change generated_at.</w:t>
+      </w:r>
+    </w:p>
+    <w:p>
+      <w:r>
+        <w:t xml:space="preserve">A stale result is retained for reference until regeneration; clients should identify it as stale.</w:t>
+      </w:r>
+    </w:p>
     <w:sectPr>
       <w:pgSz w:w="15840" w:h="12240" w:orient="landscape"/>
       <w:pgMar w:top="720" w:right="720" w:bottom="720" w:left="720" w:header="360" w:footer="360" w:gutter="0"/>

</xml_diff>